<commit_message>
mariaDB Logical Backup Documentation updated
</commit_message>
<xml_diff>
--- a/bare-metal-linux-backup-recovery/guides/mariaDB Logical Backup Documentation.docx
+++ b/bare-metal-linux-backup-recovery/guides/mariaDB Logical Backup Documentation.docx
@@ -1,6 +1,6 @@
 
 <file path=word/document.xml><?xml version="1.0" encoding="utf-8"?>
-<w:document xmlns:wpc="http://schemas.microsoft.com/office/word/2010/wordprocessingCanvas" xmlns:cx="http://schemas.microsoft.com/office/drawing/2014/chartex" xmlns:cx1="http://schemas.microsoft.com/office/drawing/2015/9/8/chartex" xmlns:cx2="http://schemas.microsoft.com/office/drawing/2015/10/21/chartex" xmlns:cx3="http://schemas.microsoft.com/office/drawing/2016/5/9/chartex" xmlns:cx4="http://schemas.microsoft.com/office/drawing/2016/5/10/chartex" xmlns:cx5="http://schemas.microsoft.com/office/drawing/2016/5/11/chartex" xmlns:cx6="http://schemas.microsoft.com/office/drawing/2016/5/12/chartex" xmlns:cx7="http://schemas.microsoft.com/office/drawing/2016/5/13/chartex" xmlns:cx8="http://schemas.microsoft.com/office/drawing/2016/5/14/chartex" xmlns:mc="http://schemas.openxmlformats.org/markup-compatibility/2006" xmlns:aink="http://schemas.microsoft.com/office/drawing/2016/ink" xmlns:am3d="http://schemas.microsoft.com/office/drawing/2017/model3d" xmlns:o="urn:schemas-microsoft-com:office:office" xmlns:oel="http://schemas.microsoft.com/office/2019/extlst" xmlns:r="http://schemas.openxmlformats.org/officeDocument/2006/relationships" xmlns:m="http://schemas.openxmlformats.org/officeDocument/2006/math" xmlns:v="urn:schemas-microsoft-com:vml" xmlns:wp14="http://schemas.microsoft.com/office/word/2010/wordprocessingDrawing" xmlns:wp="http://schemas.openxmlformats.org/drawingml/2006/wordprocessingDrawing" xmlns:w10="urn:schemas-microsoft-com:office:word" xmlns:w="http://schemas.openxmlformats.org/wordprocessingml/2006/main" xmlns:w14="http://schemas.microsoft.com/office/word/2010/wordml" xmlns:w15="http://schemas.microsoft.com/office/word/2012/wordml" xmlns:w16cei="http://schemas.microsoft.com/office/word/2026/wordml/cei" xmlns:w16cex="http://schemas.microsoft.com/office/word/2018/wordml/cex" xmlns:w16cid="http://schemas.microsoft.com/office/word/2016/wordml/cid" xmlns:w16="http://schemas.microsoft.com/office/word/2018/wordml" xmlns:w16du="http://schemas.microsoft.com/office/word/2023/wordml/word16du" xmlns:w16sdtdh="http://schemas.microsoft.com/office/word/2020/wordml/sdtdatahash" xmlns:w16sdtfl="http://schemas.microsoft.com/office/word/2024/wordml/sdtformatlock" xmlns:w16se="http://schemas.microsoft.com/office/word/2015/wordml/symex" xmlns:wpg="http://schemas.microsoft.com/office/word/2010/wordprocessingGroup" xmlns:wpi="http://schemas.microsoft.com/office/word/2010/wordprocessingInk" xmlns:wne="http://schemas.microsoft.com/office/word/2006/wordml" xmlns:wps="http://schemas.microsoft.com/office/word/2010/wordprocessingShape" mc:Ignorable="w14 w15 w16se w16cid w16 w16cex w16sdtdh w16sdtfl w16du wp14">
+<w:document xmlns:wpc="http://schemas.microsoft.com/office/word/2010/wordprocessingCanvas" xmlns:cx="http://schemas.microsoft.com/office/drawing/2014/chartex" xmlns:cx1="http://schemas.microsoft.com/office/drawing/2015/9/8/chartex" xmlns:cx2="http://schemas.microsoft.com/office/drawing/2015/10/21/chartex" xmlns:cx3="http://schemas.microsoft.com/office/drawing/2016/5/9/chartex" xmlns:cx4="http://schemas.microsoft.com/office/drawing/2016/5/10/chartex" xmlns:cx5="http://schemas.microsoft.com/office/drawing/2016/5/11/chartex" xmlns:cx6="http://schemas.microsoft.com/office/drawing/2016/5/12/chartex" xmlns:cx7="http://schemas.microsoft.com/office/drawing/2016/5/13/chartex" xmlns:cx8="http://schemas.microsoft.com/office/drawing/2016/5/14/chartex" xmlns:mc="http://schemas.openxmlformats.org/markup-compatibility/2006" xmlns:aink="http://schemas.microsoft.com/office/drawing/2016/ink" xmlns:am3d="http://schemas.microsoft.com/office/drawing/2017/model3d" xmlns:o="urn:schemas-microsoft-com:office:office" xmlns:oel="http://schemas.microsoft.com/office/2019/extlst" xmlns:r="http://schemas.openxmlformats.org/officeDocument/2006/relationships" xmlns:m="http://schemas.openxmlformats.org/officeDocument/2006/math" xmlns:v="urn:schemas-microsoft-com:vml" xmlns:wp14="http://schemas.microsoft.com/office/word/2010/wordprocessingDrawing" xmlns:wp="http://schemas.openxmlformats.org/drawingml/2006/wordprocessingDrawing" xmlns:w10="urn:schemas-microsoft-com:office:word" xmlns:w="http://schemas.openxmlformats.org/wordprocessingml/2006/main" xmlns:w14="http://schemas.microsoft.com/office/word/2010/wordml" xmlns:w15="http://schemas.microsoft.com/office/word/2012/wordml" xmlns:w16cex="http://schemas.microsoft.com/office/word/2018/wordml/cex" xmlns:w16cid="http://schemas.microsoft.com/office/word/2016/wordml/cid" xmlns:w16="http://schemas.microsoft.com/office/word/2018/wordml" xmlns:w16du="http://schemas.microsoft.com/office/word/2023/wordml/word16du" xmlns:w16sdtdh="http://schemas.microsoft.com/office/word/2020/wordml/sdtdatahash" xmlns:w16sdtfl="http://schemas.microsoft.com/office/word/2024/wordml/sdtformatlock" xmlns:w16se="http://schemas.microsoft.com/office/word/2015/wordml/symex" xmlns:wpg="http://schemas.microsoft.com/office/word/2010/wordprocessingGroup" xmlns:wpi="http://schemas.microsoft.com/office/word/2010/wordprocessingInk" xmlns:wne="http://schemas.microsoft.com/office/word/2006/wordml" xmlns:wps="http://schemas.microsoft.com/office/word/2010/wordprocessingShape" mc:Ignorable="w14 w15 w16se w16cid w16 w16cex w16sdtdh w16sdtfl w16du wp14">
   <w:body>
     <w:p>
       <w:pPr>
@@ -1140,6 +1140,9 @@
     <w:p>
       <w:pPr>
         <w:pStyle w:val="SourceCode"/>
+        <w:rPr>
+          <w:lang w:val="en-AU"/>
+        </w:rPr>
       </w:pPr>
       <w:r>
         <w:rPr>
@@ -1147,6 +1150,82 @@
         </w:rPr>
         <w:lastRenderedPageBreak/>
         <w:t>/var/lib/backups/logical_datasphere/Mon</w:t>
+      </w:r>
+      <w:r>
+        <w:rPr>
+          <w:rStyle w:val="VerbatimChar"/>
+        </w:rPr>
+        <w:br/>
+      </w:r>
+      <w:r>
+        <w:rPr>
+          <w:rStyle w:val="VerbatimChar"/>
+        </w:rPr>
+        <w:br/>
+      </w:r>
+      <w:r>
+        <w:rPr>
+          <w:b/>
+          <w:bCs/>
+          <w:lang w:val="en-AU"/>
+        </w:rPr>
+        <w:t>OVH remote backup</w:t>
+      </w:r>
+    </w:p>
+    <w:p>
+      <w:pPr>
+        <w:pStyle w:val="SourceCode"/>
+        <w:rPr>
+          <w:lang w:val="en-AU"/>
+        </w:rPr>
+      </w:pPr>
+      <w:r>
+        <w:rPr>
+          <w:lang w:val="en-AU"/>
+        </w:rPr>
+        <w:t>After successfully completing the local SQL backup, the script automatically copies the completed weekday backup directory to OVH Backup Storage, preserving the directory structure.</w:t>
+      </w:r>
+    </w:p>
+    <w:p>
+      <w:pPr>
+        <w:pStyle w:val="SourceCode"/>
+        <w:rPr>
+          <w:lang w:val="en-AU"/>
+        </w:rPr>
+      </w:pPr>
+      <w:r>
+        <w:rPr>
+          <w:lang w:val="en-AU"/>
+        </w:rPr>
+        <w:t>Remote backup location:</w:t>
+      </w:r>
+    </w:p>
+    <w:p>
+      <w:pPr>
+        <w:pStyle w:val="SourceCode"/>
+        <w:rPr>
+          <w:lang w:val="en-AU"/>
+        </w:rPr>
+      </w:pPr>
+      <w:r>
+        <w:rPr>
+          <w:lang w:val="en-AU"/>
+        </w:rPr>
+        <w:t>/mnt/ovh-backup/var/lib/backups/logical_datasphere/&lt;weekday&gt;</w:t>
+      </w:r>
+    </w:p>
+    <w:p>
+      <w:pPr>
+        <w:pStyle w:val="SourceCode"/>
+        <w:rPr>
+          <w:lang w:val="en-AU"/>
+        </w:rPr>
+      </w:pPr>
+      <w:r>
+        <w:rPr>
+          <w:lang w:val="en-AU"/>
+        </w:rPr>
+        <w:t>The script checks whether OVH storage is mounted and attempts to mount it if necessary. If the mount or transfer fails, a warning is reported, but the successful local database backup is unaffected. The previous remote backup is preserved if the transfer fails.</w:t>
       </w:r>
     </w:p>
     <w:p>
@@ -1426,6 +1505,7 @@
       <w:bookmarkStart w:id="13" w:name="large-table-files"/>
       <w:bookmarkEnd w:id="12"/>
       <w:r>
+        <w:lastRenderedPageBreak/>
         <w:t>Large-table files</w:t>
       </w:r>
     </w:p>
@@ -1518,7 +1598,6 @@
         <w:rPr>
           <w:rStyle w:val="ExtensionTok"/>
         </w:rPr>
-        <w:lastRenderedPageBreak/>
         <w:t>/usr/local/sbin/</w:t>
       </w:r>
       <w:r>
@@ -1886,6 +1965,7 @@
         </w:numPr>
       </w:pPr>
       <w:r>
+        <w:lastRenderedPageBreak/>
         <w:t xml:space="preserve">the </w:t>
       </w:r>
       <w:r>
@@ -1966,13 +2046,96 @@
     <w:p>
       <w:pPr>
         <w:pStyle w:val="SourceCode"/>
-      </w:pPr>
-      <w:r>
         <w:rPr>
           <w:rStyle w:val="VerbatimChar"/>
         </w:rPr>
+      </w:pPr>
+      <w:r>
+        <w:rPr>
+          <w:rStyle w:val="VerbatimChar"/>
+        </w:rPr>
         <w:t>/var/lib/backups/logical/Mon</w:t>
       </w:r>
+    </w:p>
+    <w:p>
+      <w:pPr>
+        <w:pStyle w:val="SourceCode"/>
+        <w:rPr>
+          <w:lang w:val="en-AU"/>
+        </w:rPr>
+      </w:pPr>
+      <w:r>
+        <w:rPr>
+          <w:b/>
+          <w:bCs/>
+          <w:lang w:val="en-AU"/>
+        </w:rPr>
+        <w:t>OVH remote backup</w:t>
+      </w:r>
+    </w:p>
+    <w:p>
+      <w:pPr>
+        <w:pStyle w:val="SourceCode"/>
+        <w:rPr>
+          <w:lang w:val="en-AU"/>
+        </w:rPr>
+      </w:pPr>
+      <w:r>
+        <w:rPr>
+          <w:lang w:val="en-AU"/>
+        </w:rPr>
+        <w:t>After successfully completing the local SQL backup, the script automatically copies the completed weekday backup directory to OVH Backup Storage, preserving the directory structure.</w:t>
+      </w:r>
+    </w:p>
+    <w:p>
+      <w:pPr>
+        <w:pStyle w:val="SourceCode"/>
+        <w:rPr>
+          <w:lang w:val="en-AU"/>
+        </w:rPr>
+      </w:pPr>
+      <w:r>
+        <w:rPr>
+          <w:lang w:val="en-AU"/>
+        </w:rPr>
+        <w:t>Remote backup location:</w:t>
+      </w:r>
+    </w:p>
+    <w:p>
+      <w:pPr>
+        <w:pStyle w:val="SourceCode"/>
+        <w:rPr>
+          <w:lang w:val="en-AU"/>
+        </w:rPr>
+      </w:pPr>
+      <w:r>
+        <w:rPr>
+          <w:lang w:val="en-AU"/>
+        </w:rPr>
+        <w:t>/mnt/ovh-backup/var/lib/backups/logical/&lt;weekday&gt;</w:t>
+      </w:r>
+    </w:p>
+    <w:p>
+      <w:pPr>
+        <w:pStyle w:val="SourceCode"/>
+        <w:rPr>
+          <w:lang w:val="en-AU"/>
+        </w:rPr>
+      </w:pPr>
+      <w:r>
+        <w:rPr>
+          <w:lang w:val="en-AU"/>
+        </w:rPr>
+        <w:t>The script checks whether OVH storage is mounted and attempts to mount it if necessary. If the mount or transfer fails, a warning is reported, but the successful local database backup is unaffected. The previous remote backup is preserved if the transfer fails.</w:t>
+      </w:r>
+    </w:p>
+    <w:p>
+      <w:pPr>
+        <w:pStyle w:val="SourceCode"/>
+        <w:rPr>
+          <w:lang w:val="en-AU"/>
+        </w:rPr>
+      </w:pPr>
     </w:p>
     <w:p>
       <w:pPr>
@@ -1981,7 +2144,6 @@
       <w:bookmarkStart w:id="18" w:name="metrics-output-structure"/>
       <w:bookmarkEnd w:id="17"/>
       <w:r>
-        <w:lastRenderedPageBreak/>
         <w:t>10. Metrics output structure</w:t>
       </w:r>
     </w:p>
@@ -2138,6 +2300,7 @@
         </w:numPr>
       </w:pPr>
       <w:r>
+        <w:lastRenderedPageBreak/>
         <w:t>foreign keys;</w:t>
       </w:r>
     </w:p>
@@ -2368,7 +2531,6 @@
       <w:bookmarkEnd w:id="18"/>
       <w:bookmarkEnd w:id="22"/>
       <w:r>
-        <w:lastRenderedPageBreak/>
         <w:t>11. Month range</w:t>
       </w:r>
     </w:p>
@@ -2502,6 +2664,7 @@
         <w:rPr>
           <w:rStyle w:val="ExtensionTok"/>
         </w:rPr>
+        <w:lastRenderedPageBreak/>
         <w:t>/usr/local/sbin/</w:t>
       </w:r>
       <w:r>
@@ -2868,7 +3031,6 @@
       <w:bookmarkStart w:id="25" w:name="verifying-a-backup"/>
       <w:bookmarkEnd w:id="24"/>
       <w:r>
-        <w:lastRenderedPageBreak/>
         <w:t>13. Verifying a backup</w:t>
       </w:r>
     </w:p>
@@ -3280,6 +3442,7 @@
         <w:pStyle w:val="BodyText"/>
       </w:pPr>
       <w:r>
+        <w:lastRenderedPageBreak/>
         <w:t>A version that prints each file first:</w:t>
       </w:r>
     </w:p>
@@ -3695,7 +3858,6 @@
         </w:numPr>
       </w:pPr>
       <w:r>
-        <w:lastRenderedPageBreak/>
         <w:t>schema;</w:t>
       </w:r>
     </w:p>
@@ -3872,6 +4034,7 @@
       <w:bookmarkStart w:id="33" w:name="creating-an-empty-restore-database"/>
       <w:bookmarkEnd w:id="32"/>
       <w:r>
+        <w:lastRenderedPageBreak/>
         <w:t>16. Creating an empty restore database</w:t>
       </w:r>
     </w:p>
@@ -4067,7 +4230,6 @@
     </w:p>
     <w:p>
       <w:r>
-        <w:lastRenderedPageBreak/>
         <w:pict w14:anchorId="45F83601">
           <v:rect id="_x0000_i1032" style="width:0;height:1.5pt" o:hralign="center" o:hrstd="t" o:hr="t"/>
         </w:pict>
@@ -4597,6 +4759,7 @@
         <w:br/>
       </w:r>
       <w:r>
+        <w:lastRenderedPageBreak/>
         <w:br/>
       </w:r>
       <w:r>
@@ -4712,10 +4875,7 @@
       <w:bookmarkStart w:id="38" w:name="complete-datasphere-restore-sequence"/>
       <w:bookmarkEnd w:id="37"/>
       <w:r>
-        <w:t xml:space="preserve">17a </w:t>
-      </w:r>
-      <w:r>
-        <w:t>Complete Datasphere restore sequence</w:t>
+        <w:t>17a Complete Datasphere restore sequence</w:t>
       </w:r>
     </w:p>
     <w:p>
@@ -4935,7 +5095,6 @@
               <w:rPr>
                 <w:lang w:val="en-AU"/>
               </w:rPr>
-              <w:lastRenderedPageBreak/>
               <w:t>--backup-dir DIR</w:t>
             </w:r>
           </w:p>
@@ -5405,6 +5564,7 @@
           <w:bCs/>
           <w:lang w:val="en-AU"/>
         </w:rPr>
+        <w:lastRenderedPageBreak/>
         <w:t>Behaviour</w:t>
       </w:r>
     </w:p>
@@ -5513,7 +5673,6 @@
         <w:rPr>
           <w:lang w:val="en-AU"/>
         </w:rPr>
-        <w:lastRenderedPageBreak/>
         <w:t>Restore a different weekday into a differently named test database:</w:t>
       </w:r>
     </w:p>
@@ -5718,6 +5877,7 @@
         <w:rPr>
           <w:lang w:val="en-AU"/>
         </w:rPr>
+        <w:lastRenderedPageBreak/>
         <w:t>And the row-count validation step is still on the table — I'd add it to both scripts and extend the "Notes and cautions" in each section to describe it. Want me to do that, and which of the two assembly options above do you prefer?</w:t>
       </w:r>
     </w:p>
@@ -6026,7 +6186,6 @@
       <w:bookmarkStart w:id="42" w:name="step-3-restore-demand"/>
       <w:bookmarkEnd w:id="41"/>
       <w:r>
-        <w:lastRenderedPageBreak/>
         <w:t xml:space="preserve">Step 3: restore </w:t>
       </w:r>
       <w:r>
@@ -6866,6 +7025,7 @@
         <w:rPr>
           <w:rStyle w:val="NormalTok"/>
         </w:rPr>
+        <w:lastRenderedPageBreak/>
         <w:t xml:space="preserve">  </w:t>
       </w:r>
       <w:r>
@@ -7257,10 +7417,7 @@
       <w:bookmarkStart w:id="45" w:name="complete-metrics-restore-sequence"/>
       <w:bookmarkEnd w:id="44"/>
       <w:r>
-        <w:t xml:space="preserve">18a </w:t>
-      </w:r>
-      <w:r>
-        <w:t>Complete Metrics restore sequence</w:t>
+        <w:t>18a Complete Metrics restore sequence</w:t>
       </w:r>
     </w:p>
     <w:p>
@@ -7422,7 +7579,6 @@
                 <w:bCs/>
                 <w:lang w:val="en-AU"/>
               </w:rPr>
-              <w:lastRenderedPageBreak/>
               <w:t>Option</w:t>
             </w:r>
           </w:p>
@@ -8052,7 +8208,14 @@
         <w:rPr>
           <w:lang w:val="en-AU"/>
         </w:rPr>
-        <w:t>The script restores in the required order: schema first, then ordinary tables, then demand, then each monthly daily_requests file. As in the manual procedure, the schema dump does not create the database itself, so the target database must exist before the data is loaded. Passing --create-db creates it with the specified character set and collation; without that option, the database must already exist or the script stops with an error.</w:t>
+        <w:t xml:space="preserve">The script restores in the required order: schema first, then ordinary tables, then demand, then each monthly daily_requests file. As in the manual procedure, the schema dump does </w:t>
+      </w:r>
+      <w:r>
+        <w:rPr>
+          <w:lang w:val="en-AU"/>
+        </w:rPr>
+        <w:lastRenderedPageBreak/>
+        <w:t>not create the database itself, so the target database must exist before the data is loaded. Passing --create-db creates it with the specified character set and collation; without that option, the database must already exist or the script stops with an error.</w:t>
       </w:r>
     </w:p>
     <w:p>
@@ -8180,7 +8343,6 @@
         <w:rPr>
           <w:lang w:val="en-AU"/>
         </w:rPr>
-        <w:lastRenderedPageBreak/>
         <w:t xml:space="preserve">  --backup-dir /var/lib/backups/logical/Tue \</w:t>
       </w:r>
     </w:p>
@@ -8355,6 +8517,7 @@
       <w:bookmarkEnd w:id="39"/>
       <w:bookmarkEnd w:id="45"/>
       <w:r>
+        <w:lastRenderedPageBreak/>
         <w:t>19. Monitoring a long restore</w:t>
       </w:r>
     </w:p>
@@ -8644,7 +8807,6 @@
       <w:bookmarkStart w:id="47" w:name="validating-a-restored-database"/>
       <w:bookmarkEnd w:id="46"/>
       <w:r>
-        <w:lastRenderedPageBreak/>
         <w:t>20. Validating a restored database</w:t>
       </w:r>
     </w:p>
@@ -9050,6 +9212,7 @@
         <w:rPr>
           <w:rStyle w:val="StringTok"/>
         </w:rPr>
+        <w:lastRenderedPageBreak/>
         <w:t xml:space="preserve">   GROUP BY month</w:t>
       </w:r>
       <w:r>
@@ -9216,7 +9379,6 @@
         <w:pStyle w:val="FirstParagraph"/>
       </w:pPr>
       <w:r>
-        <w:lastRenderedPageBreak/>
         <w:t>Example: run Metrics daily at 02:00:</w:t>
       </w:r>
     </w:p>
@@ -9430,6 +9592,7 @@
       <w:bookmarkStart w:id="52" w:name="operational-cautions"/>
       <w:bookmarkEnd w:id="51"/>
       <w:r>
+        <w:lastRenderedPageBreak/>
         <w:t>22. Operational cautions</w:t>
       </w:r>
     </w:p>
@@ -9602,7 +9765,6 @@
         <w:pStyle w:val="BodyText"/>
       </w:pPr>
       <w:r>
-        <w:lastRenderedPageBreak/>
         <w:t>This does not provide the same consistency guarantee for non-transactional tables such as MyISAM or Aria. If such tables contain changing data, review their backup requirements separately.</w:t>
       </w:r>
     </w:p>
@@ -9747,16 +9909,45 @@
       <w:bookmarkStart w:id="58" w:name="backup-location"/>
       <w:bookmarkEnd w:id="57"/>
       <w:r>
-        <w:t>Backup location</w:t>
+        <w:t>Backup location and remote storage</w:t>
       </w:r>
     </w:p>
     <w:p>
       <w:pPr>
         <w:pStyle w:val="FirstParagraph"/>
-      </w:pPr>
-      <w:r>
-        <w:t>A backup stored only on the same server and disk as the live database does not protect against total server or disk loss. Copy completed backup sets to separate storage when possible.</w:t>
-      </w:r>
+        <w:rPr>
+          <w:lang w:val="en-AU"/>
+        </w:rPr>
+      </w:pPr>
+      <w:r>
+        <w:rPr>
+          <w:lang w:val="en-AU"/>
+        </w:rPr>
+        <w:t>Both logical backup scripts automatically copy completed backup sets to OVH Backup Storage, providing an off-server copy in addition to the local backups. Files are transferred using rsync, preserving their directory structure.</w:t>
+      </w:r>
+    </w:p>
+    <w:p>
+      <w:pPr>
+        <w:pStyle w:val="FirstParagraph"/>
+        <w:rPr>
+          <w:lang w:val="en-AU"/>
+        </w:rPr>
+      </w:pPr>
+      <w:r>
+        <w:rPr>
+          <w:lang w:val="en-AU"/>
+        </w:rPr>
+        <w:lastRenderedPageBreak/>
+        <w:t>Remote synchronisation is performed only after the local SQL backup completes successfully. A remote storage or transfer failure does not invalidate the local backup, but the warning should be investigated to ensure off-server protection is maintained.</w:t>
+      </w:r>
+    </w:p>
+    <w:p>
+      <w:pPr>
+        <w:pStyle w:val="FirstParagraph"/>
+        <w:rPr>
+          <w:lang w:val="en-AU"/>
+        </w:rPr>
+      </w:pPr>
     </w:p>
     <w:p>
       <w:pPr>
@@ -10127,7 +10318,6 @@
       <w:bookmarkStart w:id="66" w:name="list-available-weekday-backups"/>
       <w:bookmarkEnd w:id="65"/>
       <w:r>
-        <w:lastRenderedPageBreak/>
         <w:t>List available weekday backups</w:t>
       </w:r>
     </w:p>
@@ -10332,7 +10522,7 @@
 </file>
 
 <file path=word/endnotes.xml><?xml version="1.0" encoding="utf-8"?>
-<w:endnotes xmlns:wpc="http://schemas.microsoft.com/office/word/2010/wordprocessingCanvas" xmlns:cx="http://schemas.microsoft.com/office/drawing/2014/chartex" xmlns:cx1="http://schemas.microsoft.com/office/drawing/2015/9/8/chartex" xmlns:cx2="http://schemas.microsoft.com/office/drawing/2015/10/21/chartex" xmlns:cx3="http://schemas.microsoft.com/office/drawing/2016/5/9/chartex" xmlns:cx4="http://schemas.microsoft.com/office/drawing/2016/5/10/chartex" xmlns:cx5="http://schemas.microsoft.com/office/drawing/2016/5/11/chartex" xmlns:cx6="http://schemas.microsoft.com/office/drawing/2016/5/12/chartex" xmlns:cx7="http://schemas.microsoft.com/office/drawing/2016/5/13/chartex" xmlns:cx8="http://schemas.microsoft.com/office/drawing/2016/5/14/chartex" xmlns:mc="http://schemas.openxmlformats.org/markup-compatibility/2006" xmlns:aink="http://schemas.microsoft.com/office/drawing/2016/ink" xmlns:am3d="http://schemas.microsoft.com/office/drawing/2017/model3d" xmlns:o="urn:schemas-microsoft-com:office:office" xmlns:oel="http://schemas.microsoft.com/office/2019/extlst" xmlns:r="http://schemas.openxmlformats.org/officeDocument/2006/relationships" xmlns:m="http://schemas.openxmlformats.org/officeDocument/2006/math" xmlns:v="urn:schemas-microsoft-com:vml" xmlns:wp14="http://schemas.microsoft.com/office/word/2010/wordprocessingDrawing" xmlns:wp="http://schemas.openxmlformats.org/drawingml/2006/wordprocessingDrawing" xmlns:w10="urn:schemas-microsoft-com:office:word" xmlns:w="http://schemas.openxmlformats.org/wordprocessingml/2006/main" xmlns:w14="http://schemas.microsoft.com/office/word/2010/wordml" xmlns:w15="http://schemas.microsoft.com/office/word/2012/wordml" xmlns:w16cei="http://schemas.microsoft.com/office/word/2026/wordml/cei" xmlns:w16cex="http://schemas.microsoft.com/office/word/2018/wordml/cex" xmlns:w16cid="http://schemas.microsoft.com/office/word/2016/wordml/cid" xmlns:w16="http://schemas.microsoft.com/office/word/2018/wordml" xmlns:w16du="http://schemas.microsoft.com/office/word/2023/wordml/word16du" xmlns:w16sdtdh="http://schemas.microsoft.com/office/word/2020/wordml/sdtdatahash" xmlns:w16sdtfl="http://schemas.microsoft.com/office/word/2024/wordml/sdtformatlock" xmlns:w16se="http://schemas.microsoft.com/office/word/2015/wordml/symex" xmlns:wpg="http://schemas.microsoft.com/office/word/2010/wordprocessingGroup" xmlns:wpi="http://schemas.microsoft.com/office/word/2010/wordprocessingInk" xmlns:wne="http://schemas.microsoft.com/office/word/2006/wordml" xmlns:wps="http://schemas.microsoft.com/office/word/2010/wordprocessingShape" mc:Ignorable="w14 w15 w16se w16cid w16 w16cex w16sdtdh w16sdtfl w16du wp14">
+<w:endnotes xmlns:wpc="http://schemas.microsoft.com/office/word/2010/wordprocessingCanvas" xmlns:cx="http://schemas.microsoft.com/office/drawing/2014/chartex" xmlns:cx1="http://schemas.microsoft.com/office/drawing/2015/9/8/chartex" xmlns:cx2="http://schemas.microsoft.com/office/drawing/2015/10/21/chartex" xmlns:cx3="http://schemas.microsoft.com/office/drawing/2016/5/9/chartex" xmlns:cx4="http://schemas.microsoft.com/office/drawing/2016/5/10/chartex" xmlns:cx5="http://schemas.microsoft.com/office/drawing/2016/5/11/chartex" xmlns:cx6="http://schemas.microsoft.com/office/drawing/2016/5/12/chartex" xmlns:cx7="http://schemas.microsoft.com/office/drawing/2016/5/13/chartex" xmlns:cx8="http://schemas.microsoft.com/office/drawing/2016/5/14/chartex" xmlns:mc="http://schemas.openxmlformats.org/markup-compatibility/2006" xmlns:aink="http://schemas.microsoft.com/office/drawing/2016/ink" xmlns:am3d="http://schemas.microsoft.com/office/drawing/2017/model3d" xmlns:o="urn:schemas-microsoft-com:office:office" xmlns:oel="http://schemas.microsoft.com/office/2019/extlst" xmlns:r="http://schemas.openxmlformats.org/officeDocument/2006/relationships" xmlns:m="http://schemas.openxmlformats.org/officeDocument/2006/math" xmlns:v="urn:schemas-microsoft-com:vml" xmlns:wp14="http://schemas.microsoft.com/office/word/2010/wordprocessingDrawing" xmlns:wp="http://schemas.openxmlformats.org/drawingml/2006/wordprocessingDrawing" xmlns:w10="urn:schemas-microsoft-com:office:word" xmlns:w="http://schemas.openxmlformats.org/wordprocessingml/2006/main" xmlns:w14="http://schemas.microsoft.com/office/word/2010/wordml" xmlns:w15="http://schemas.microsoft.com/office/word/2012/wordml" xmlns:w16cex="http://schemas.microsoft.com/office/word/2018/wordml/cex" xmlns:w16cid="http://schemas.microsoft.com/office/word/2016/wordml/cid" xmlns:w16="http://schemas.microsoft.com/office/word/2018/wordml" xmlns:w16du="http://schemas.microsoft.com/office/word/2023/wordml/word16du" xmlns:w16sdtdh="http://schemas.microsoft.com/office/word/2020/wordml/sdtdatahash" xmlns:w16sdtfl="http://schemas.microsoft.com/office/word/2024/wordml/sdtformatlock" xmlns:w16se="http://schemas.microsoft.com/office/word/2015/wordml/symex" xmlns:wpg="http://schemas.microsoft.com/office/word/2010/wordprocessingGroup" xmlns:wpi="http://schemas.microsoft.com/office/word/2010/wordprocessingInk" xmlns:wne="http://schemas.microsoft.com/office/word/2006/wordml" xmlns:wps="http://schemas.microsoft.com/office/word/2010/wordprocessingShape" mc:Ignorable="w14 w15 w16se w16cid w16 w16cex w16sdtdh w16sdtfl w16du wp14">
   <w:endnote w:type="separator" w:id="-1">
     <w:p>
       <w:pPr>
@@ -10357,7 +10547,7 @@
 </file>
 
 <file path=word/footnotes.xml><?xml version="1.0" encoding="utf-8"?>
-<w:footnotes xmlns:wpc="http://schemas.microsoft.com/office/word/2010/wordprocessingCanvas" xmlns:cx="http://schemas.microsoft.com/office/drawing/2014/chartex" xmlns:cx1="http://schemas.microsoft.com/office/drawing/2015/9/8/chartex" xmlns:cx2="http://schemas.microsoft.com/office/drawing/2015/10/21/chartex" xmlns:cx3="http://schemas.microsoft.com/office/drawing/2016/5/9/chartex" xmlns:cx4="http://schemas.microsoft.com/office/drawing/2016/5/10/chartex" xmlns:cx5="http://schemas.microsoft.com/office/drawing/2016/5/11/chartex" xmlns:cx6="http://schemas.microsoft.com/office/drawing/2016/5/12/chartex" xmlns:cx7="http://schemas.microsoft.com/office/drawing/2016/5/13/chartex" xmlns:cx8="http://schemas.microsoft.com/office/drawing/2016/5/14/chartex" xmlns:mc="http://schemas.openxmlformats.org/markup-compatibility/2006" xmlns:aink="http://schemas.microsoft.com/office/drawing/2016/ink" xmlns:am3d="http://schemas.microsoft.com/office/drawing/2017/model3d" xmlns:o="urn:schemas-microsoft-com:office:office" xmlns:oel="http://schemas.microsoft.com/office/2019/extlst" xmlns:r="http://schemas.openxmlformats.org/officeDocument/2006/relationships" xmlns:m="http://schemas.openxmlformats.org/officeDocument/2006/math" xmlns:v="urn:schemas-microsoft-com:vml" xmlns:wp14="http://schemas.microsoft.com/office/word/2010/wordprocessingDrawing" xmlns:wp="http://schemas.openxmlformats.org/drawingml/2006/wordprocessingDrawing" xmlns:w10="urn:schemas-microsoft-com:office:word" xmlns:w="http://schemas.openxmlformats.org/wordprocessingml/2006/main" xmlns:w14="http://schemas.microsoft.com/office/word/2010/wordml" xmlns:w15="http://schemas.microsoft.com/office/word/2012/wordml" xmlns:w16cei="http://schemas.microsoft.com/office/word/2026/wordml/cei" xmlns:w16cex="http://schemas.microsoft.com/office/word/2018/wordml/cex" xmlns:w16cid="http://schemas.microsoft.com/office/word/2016/wordml/cid" xmlns:w16="http://schemas.microsoft.com/office/word/2018/wordml" xmlns:w16du="http://schemas.microsoft.com/office/word/2023/wordml/word16du" xmlns:w16sdtdh="http://schemas.microsoft.com/office/word/2020/wordml/sdtdatahash" xmlns:w16sdtfl="http://schemas.microsoft.com/office/word/2024/wordml/sdtformatlock" xmlns:w16se="http://schemas.microsoft.com/office/word/2015/wordml/symex" xmlns:wpg="http://schemas.microsoft.com/office/word/2010/wordprocessingGroup" xmlns:wpi="http://schemas.microsoft.com/office/word/2010/wordprocessingInk" xmlns:wne="http://schemas.microsoft.com/office/word/2006/wordml" xmlns:wps="http://schemas.microsoft.com/office/word/2010/wordprocessingShape" mc:Ignorable="w14 w15 w16se w16cid w16 w16cex w16sdtdh w16sdtfl w16du wp14">
+<w:footnotes xmlns:wpc="http://schemas.microsoft.com/office/word/2010/wordprocessingCanvas" xmlns:cx="http://schemas.microsoft.com/office/drawing/2014/chartex" xmlns:cx1="http://schemas.microsoft.com/office/drawing/2015/9/8/chartex" xmlns:cx2="http://schemas.microsoft.com/office/drawing/2015/10/21/chartex" xmlns:cx3="http://schemas.microsoft.com/office/drawing/2016/5/9/chartex" xmlns:cx4="http://schemas.microsoft.com/office/drawing/2016/5/10/chartex" xmlns:cx5="http://schemas.microsoft.com/office/drawing/2016/5/11/chartex" xmlns:cx6="http://schemas.microsoft.com/office/drawing/2016/5/12/chartex" xmlns:cx7="http://schemas.microsoft.com/office/drawing/2016/5/13/chartex" xmlns:cx8="http://schemas.microsoft.com/office/drawing/2016/5/14/chartex" xmlns:mc="http://schemas.openxmlformats.org/markup-compatibility/2006" xmlns:aink="http://schemas.microsoft.com/office/drawing/2016/ink" xmlns:am3d="http://schemas.microsoft.com/office/drawing/2017/model3d" xmlns:o="urn:schemas-microsoft-com:office:office" xmlns:oel="http://schemas.microsoft.com/office/2019/extlst" xmlns:r="http://schemas.openxmlformats.org/officeDocument/2006/relationships" xmlns:m="http://schemas.openxmlformats.org/officeDocument/2006/math" xmlns:v="urn:schemas-microsoft-com:vml" xmlns:wp14="http://schemas.microsoft.com/office/word/2010/wordprocessingDrawing" xmlns:wp="http://schemas.openxmlformats.org/drawingml/2006/wordprocessingDrawing" xmlns:w10="urn:schemas-microsoft-com:office:word" xmlns:w="http://schemas.openxmlformats.org/wordprocessingml/2006/main" xmlns:w14="http://schemas.microsoft.com/office/word/2010/wordml" xmlns:w15="http://schemas.microsoft.com/office/word/2012/wordml" xmlns:w16cex="http://schemas.microsoft.com/office/word/2018/wordml/cex" xmlns:w16cid="http://schemas.microsoft.com/office/word/2016/wordml/cid" xmlns:w16="http://schemas.microsoft.com/office/word/2018/wordml" xmlns:w16du="http://schemas.microsoft.com/office/word/2023/wordml/word16du" xmlns:w16sdtdh="http://schemas.microsoft.com/office/word/2020/wordml/sdtdatahash" xmlns:w16sdtfl="http://schemas.microsoft.com/office/word/2024/wordml/sdtformatlock" xmlns:w16se="http://schemas.microsoft.com/office/word/2015/wordml/symex" xmlns:wpg="http://schemas.microsoft.com/office/word/2010/wordprocessingGroup" xmlns:wpi="http://schemas.microsoft.com/office/word/2010/wordprocessingInk" xmlns:wne="http://schemas.microsoft.com/office/word/2006/wordml" xmlns:wps="http://schemas.microsoft.com/office/word/2010/wordprocessingShape" mc:Ignorable="w14 w15 w16se w16cid w16 w16cex w16sdtdh w16sdtfl w16du wp14">
   <w:footnote w:type="separator" w:id="-1">
     <w:p>
       <w:r>
@@ -10376,7 +10566,7 @@
 </file>
 
 <file path=word/numbering.xml><?xml version="1.0" encoding="utf-8"?>
-<w:numbering xmlns:wpc="http://schemas.microsoft.com/office/word/2010/wordprocessingCanvas" xmlns:cx="http://schemas.microsoft.com/office/drawing/2014/chartex" xmlns:cx1="http://schemas.microsoft.com/office/drawing/2015/9/8/chartex" xmlns:cx2="http://schemas.microsoft.com/office/drawing/2015/10/21/chartex" xmlns:cx3="http://schemas.microsoft.com/office/drawing/2016/5/9/chartex" xmlns:cx4="http://schemas.microsoft.com/office/drawing/2016/5/10/chartex" xmlns:cx5="http://schemas.microsoft.com/office/drawing/2016/5/11/chartex" xmlns:cx6="http://schemas.microsoft.com/office/drawing/2016/5/12/chartex" xmlns:cx7="http://schemas.microsoft.com/office/drawing/2016/5/13/chartex" xmlns:cx8="http://schemas.microsoft.com/office/drawing/2016/5/14/chartex" xmlns:mc="http://schemas.openxmlformats.org/markup-compatibility/2006" xmlns:aink="http://schemas.microsoft.com/office/drawing/2016/ink" xmlns:am3d="http://schemas.microsoft.com/office/drawing/2017/model3d" xmlns:o="urn:schemas-microsoft-com:office:office" xmlns:oel="http://schemas.microsoft.com/office/2019/extlst" xmlns:r="http://schemas.openxmlformats.org/officeDocument/2006/relationships" xmlns:m="http://schemas.openxmlformats.org/officeDocument/2006/math" xmlns:v="urn:schemas-microsoft-com:vml" xmlns:wp14="http://schemas.microsoft.com/office/word/2010/wordprocessingDrawing" xmlns:wp="http://schemas.openxmlformats.org/drawingml/2006/wordprocessingDrawing" xmlns:w10="urn:schemas-microsoft-com:office:word" xmlns:w="http://schemas.openxmlformats.org/wordprocessingml/2006/main" xmlns:w14="http://schemas.microsoft.com/office/word/2010/wordml" xmlns:w15="http://schemas.microsoft.com/office/word/2012/wordml" xmlns:w16cei="http://schemas.microsoft.com/office/word/2026/wordml/cei" xmlns:w16cex="http://schemas.microsoft.com/office/word/2018/wordml/cex" xmlns:w16cid="http://schemas.microsoft.com/office/word/2016/wordml/cid" xmlns:w16="http://schemas.microsoft.com/office/word/2018/wordml" xmlns:w16du="http://schemas.microsoft.com/office/word/2023/wordml/word16du" xmlns:w16sdtdh="http://schemas.microsoft.com/office/word/2020/wordml/sdtdatahash" xmlns:w16sdtfl="http://schemas.microsoft.com/office/word/2024/wordml/sdtformatlock" xmlns:w16se="http://schemas.microsoft.com/office/word/2015/wordml/symex" xmlns:wpg="http://schemas.microsoft.com/office/word/2010/wordprocessingGroup" xmlns:wpi="http://schemas.microsoft.com/office/word/2010/wordprocessingInk" xmlns:wne="http://schemas.microsoft.com/office/word/2006/wordml" xmlns:wps="http://schemas.microsoft.com/office/word/2010/wordprocessingShape" mc:Ignorable="w14 w15 w16se w16cid w16 w16cex w16sdtdh w16sdtfl w16du wp14">
+<w:numbering xmlns:wpc="http://schemas.microsoft.com/office/word/2010/wordprocessingCanvas" xmlns:cx="http://schemas.microsoft.com/office/drawing/2014/chartex" xmlns:cx1="http://schemas.microsoft.com/office/drawing/2015/9/8/chartex" xmlns:cx2="http://schemas.microsoft.com/office/drawing/2015/10/21/chartex" xmlns:cx3="http://schemas.microsoft.com/office/drawing/2016/5/9/chartex" xmlns:cx4="http://schemas.microsoft.com/office/drawing/2016/5/10/chartex" xmlns:cx5="http://schemas.microsoft.com/office/drawing/2016/5/11/chartex" xmlns:cx6="http://schemas.microsoft.com/office/drawing/2016/5/12/chartex" xmlns:cx7="http://schemas.microsoft.com/office/drawing/2016/5/13/chartex" xmlns:cx8="http://schemas.microsoft.com/office/drawing/2016/5/14/chartex" xmlns:mc="http://schemas.openxmlformats.org/markup-compatibility/2006" xmlns:aink="http://schemas.microsoft.com/office/drawing/2016/ink" xmlns:am3d="http://schemas.microsoft.com/office/drawing/2017/model3d" xmlns:o="urn:schemas-microsoft-com:office:office" xmlns:oel="http://schemas.microsoft.com/office/2019/extlst" xmlns:r="http://schemas.openxmlformats.org/officeDocument/2006/relationships" xmlns:m="http://schemas.openxmlformats.org/officeDocument/2006/math" xmlns:v="urn:schemas-microsoft-com:vml" xmlns:wp14="http://schemas.microsoft.com/office/word/2010/wordprocessingDrawing" xmlns:wp="http://schemas.openxmlformats.org/drawingml/2006/wordprocessingDrawing" xmlns:w10="urn:schemas-microsoft-com:office:word" xmlns:w="http://schemas.openxmlformats.org/wordprocessingml/2006/main" xmlns:w14="http://schemas.microsoft.com/office/word/2010/wordml" xmlns:w15="http://schemas.microsoft.com/office/word/2012/wordml" xmlns:w16cex="http://schemas.microsoft.com/office/word/2018/wordml/cex" xmlns:w16cid="http://schemas.microsoft.com/office/word/2016/wordml/cid" xmlns:w16="http://schemas.microsoft.com/office/word/2018/wordml" xmlns:w16du="http://schemas.microsoft.com/office/word/2023/wordml/word16du" xmlns:w16sdtdh="http://schemas.microsoft.com/office/word/2020/wordml/sdtdatahash" xmlns:w16sdtfl="http://schemas.microsoft.com/office/word/2024/wordml/sdtformatlock" xmlns:w16se="http://schemas.microsoft.com/office/word/2015/wordml/symex" xmlns:wpg="http://schemas.microsoft.com/office/word/2010/wordprocessingGroup" xmlns:wpi="http://schemas.microsoft.com/office/word/2010/wordprocessingInk" xmlns:wne="http://schemas.microsoft.com/office/word/2006/wordml" xmlns:wps="http://schemas.microsoft.com/office/word/2010/wordprocessingShape" mc:Ignorable="w14 w15 w16se w16cid w16 w16cex w16sdtdh w16sdtfl w16du wp14">
   <w:abstractNum w:abstractNumId="0" w15:restartNumberingAfterBreak="0">
     <w:nsid w:val="0000A990"/>
     <w:multiLevelType w:val="multilevel"/>
@@ -12089,6 +12279,14 @@
       <w:shd w:val="clear" w:color="auto" w:fill="F8F8F8"/>
     </w:rPr>
   </w:style>
+  <w:style w:type="paragraph" w:styleId="NormalWeb">
+    <w:name w:val="Normal (Web)"/>
+    <w:basedOn w:val="Normal"/>
+    <w:rsid w:val="00024AFC"/>
+    <w:rPr>
+      <w:rFonts w:ascii="Times New Roman" w:hAnsi="Times New Roman" w:cs="Times New Roman"/>
+    </w:rPr>
+  </w:style>
 </w:styles>
 </file>
 

</xml_diff>